<commit_message>
JNNP-aesthetic figure rebuild and manuscript restructure
Main figures (F1-F6) rebuilt as native matplotlib in JNNP aesthetic:
- Helvetica sans-serif throughout
- Open-box axes (top/right spines removed), tick direction out
- Bold uppercase panel labels (A, B, C) in top-left of each panel
- Restrained CMYK-safe palette (navy/rust/forest, grayscale-safe)
- 300 dpi PNG plus editable vector PDF
- Annotation in F4 (conformal clinical utility) repositioned to
  lower-right empty region to remove overlap with data lines

Manuscript restructure:
- Removed standalone "Methodological corrections" Results subsection;
  NIS outcome reclassification now noted in Methods 2.3 with full
  detail in Supplementary Appendix S3
- All tables and figures collected in a dedicated "Tables and Figures"
  section at the end of the manuscript (standard journal-submission
  format) with inline references replacing inline placement
</commit_message>
<xml_diff>
--- a/docs/JNNP_main_manuscript.docx
+++ b/docs/JNNP_main_manuscript.docx
@@ -614,7 +614,7 @@
           <w:i w:val="0"/>
           <w:sz w:val="22"/>
         </w:rPr>
-        <w:t>The primary outcome was any postoperative seizure within the index admission. For NIS we explicitly distinguished acute symptomatic seizure (ICD-10 R56.x, 780.39, G41.x) from pre-existing epilepsy (G40.x, 345.x) and report both definitions. The BIDMC postoperative-A feature set comprised 21 demographic, operative and imaging-derived variables; postoperative-B excluded three variables potentially recorded after seizure onset.</w:t>
+        <w:t>The primary outcome was any postoperative seizure within the index admission. Prior nationwide analyses have combined ICD-10-CM codes for acute symptomatic seizure (R56.x, 780.39, G41.x) with codes for pre-existing epilepsy (G40.x, 345.x). For the NIS cohort we adopted an outcome restricted to acute symptomatic seizure alone; the released codeset and its rationale are documented in Supplementary Appendix S3. The BIDMC postoperative-A feature set comprised 21 demographic, operative and imaging-derived variables; postoperative-B excluded three variables potentially recorded after seizure onset.</w:t>
       </w:r>
     </w:p>
     <w:p>
@@ -879,6 +879,849 @@
           <w:color w:val="141F3A"/>
         </w:rPr>
         <w:t>Cohort characteristics</w:t>
+      </w:r>
+    </w:p>
+    <w:p>
+      <w:pPr>
+        <w:spacing w:line="360" w:lineRule="auto" w:after="120"/>
+        <w:ind w:firstLine="432"/>
+        <w:jc w:val="both"/>
+      </w:pPr>
+      <w:r>
+        <w:rPr>
+          <w:rFonts w:ascii="Times New Roman" w:hAnsi="Times New Roman"/>
+          <w:b w:val="0"/>
+          <w:i w:val="0"/>
+          <w:sz w:val="22"/>
+        </w:rPr>
+        <w:t>Cohort characteristics are summarised in Table 1.</w:t>
+      </w:r>
+    </w:p>
+    <w:p>
+      <w:pPr>
+        <w:pStyle w:val="Heading2"/>
+      </w:pPr>
+      <w:r>
+        <w:rPr>
+          <w:rFonts w:ascii="Times New Roman" w:hAnsi="Times New Roman"/>
+          <w:color w:val="141F3A"/>
+        </w:rPr>
+        <w:t>Primary discrimination performance</w:t>
+      </w:r>
+    </w:p>
+    <w:p>
+      <w:pPr>
+        <w:spacing w:line="360" w:lineRule="auto" w:after="120"/>
+        <w:ind w:firstLine="432"/>
+        <w:jc w:val="both"/>
+      </w:pPr>
+      <w:r>
+        <w:rPr>
+          <w:rFonts w:ascii="Times New Roman" w:hAnsi="Times New Roman"/>
+          <w:b w:val="0"/>
+          <w:i w:val="0"/>
+          <w:sz w:val="22"/>
+        </w:rPr>
+        <w:t>On BIDMC, Firth penalized logistic regression produced a 25-fold cross-validated AUC of 0.681 (95% CI 0.609–0.753), within noise of the published BalancedRandomForest reference (0.676; 0.595–0.760; DeLong p = 0.81). Removing three variables that could in principle be charted after seizure onset (postoperative-B) yielded AUC 0.645; the primary signal does not require post-event information. External validation in the eICU non-traumatic cohort gave AUC 0.750 (0.711–0.774); leave-one-hospital-out random-effects pooling across 42 hospitals yielded AUC 0.684 (0.651–0.714), with τ² ≈ 0 and I² = 0% (Figure 1).</w:t>
+      </w:r>
+    </w:p>
+    <w:p>
+      <w:pPr>
+        <w:pStyle w:val="Heading2"/>
+      </w:pPr>
+      <w:r>
+        <w:rPr>
+          <w:rFonts w:ascii="Times New Roman" w:hAnsi="Times New Roman"/>
+          <w:color w:val="141F3A"/>
+        </w:rPr>
+        <w:t>Calibration and clinical utility</w:t>
+      </w:r>
+    </w:p>
+    <w:p>
+      <w:pPr>
+        <w:spacing w:line="360" w:lineRule="auto" w:after="120"/>
+        <w:ind w:firstLine="432"/>
+        <w:jc w:val="both"/>
+      </w:pPr>
+      <w:r>
+        <w:rPr>
+          <w:rFonts w:ascii="Times New Roman" w:hAnsi="Times New Roman"/>
+          <w:b w:val="0"/>
+          <w:i w:val="0"/>
+          <w:sz w:val="22"/>
+        </w:rPr>
+        <w:t>Pre-recalibration, class-rebalanced classifiers assigned probabilities that were too extreme (eICU Set C: Brier 0.071, calibration slope 1.51). Cross-validated Platt scaling brought slope to within 0.99–1.04 in every model and calibration-in-the-large to |CITL| ≤ 0.03. Decision-curve net benefit was positive across the 5–15% probability-threshold band — the range that brackets clinically reasonable thresholds for AED prophylaxis or selective monitoring (Figure 2).</w:t>
+      </w:r>
+    </w:p>
+    <w:p>
+      <w:pPr>
+        <w:pStyle w:val="Heading2"/>
+      </w:pPr>
+      <w:r>
+        <w:rPr>
+          <w:rFonts w:ascii="Times New Roman" w:hAnsi="Times New Roman"/>
+          <w:color w:val="141F3A"/>
+        </w:rPr>
+        <w:t>Eleven-method modelling battery</w:t>
+      </w:r>
+    </w:p>
+    <w:p>
+      <w:pPr>
+        <w:spacing w:line="360" w:lineRule="auto" w:after="120"/>
+        <w:ind w:firstLine="432"/>
+        <w:jc w:val="both"/>
+      </w:pPr>
+      <w:r>
+        <w:rPr>
+          <w:rFonts w:ascii="Times New Roman" w:hAnsi="Times New Roman"/>
+          <w:b w:val="0"/>
+          <w:i w:val="0"/>
+          <w:sz w:val="22"/>
+        </w:rPr>
+        <w:t>Across eleven model classes, AUC was insensitive to method selection (range 0.62–0.69; all DeLong tests against baseline p &gt; 0.05 or p &lt; 0.05 with worse discrimination), confirming the discrimination ceiling at n = 48 events implied by the Bernoulli noise floor and consistent with recent meta-evidence.</w:t>
+      </w:r>
+      <w:r>
+        <w:rPr>
+          <w:rFonts w:ascii="Times New Roman" w:hAnsi="Times New Roman"/>
+          <w:b w:val="0"/>
+          <w:i w:val="0"/>
+          <w:sz w:val="22"/>
+          <w:vertAlign w:val="superscript"/>
+        </w:rPr>
+        <w:t>¹⁷⁻¹⁹</w:t>
+      </w:r>
+      <w:r>
+        <w:rPr>
+          <w:rFonts w:ascii="Times New Roman" w:hAnsi="Times New Roman"/>
+          <w:b w:val="0"/>
+          <w:i w:val="0"/>
+          <w:sz w:val="22"/>
+        </w:rPr>
+        <w:t xml:space="preserve"> Calibration, by contrast, varied substantially across methods: Brier score ranged from 0.067 (Firth and stacking) to 0.228 (BalancedRandomForest baseline) — a more-than-threefold difference (Figure 3). Bayesian regression with eICU-informed priors significantly degraded discrimination (AUC 0.515, DeLong p = 0.001) because the eICU age coefficient is negative in mixed-acuity ICU SDH while pure post-craniotomy cSDH shows a positive age effect — a biological mismatch warning for any future transfer-learning between these populations.</w:t>
+      </w:r>
+    </w:p>
+    <w:p>
+      <w:pPr>
+        <w:pStyle w:val="Heading2"/>
+      </w:pPr>
+      <w:r>
+        <w:rPr>
+          <w:rFonts w:ascii="Times New Roman" w:hAnsi="Times New Roman"/>
+          <w:color w:val="141F3A"/>
+        </w:rPr>
+        <w:t>Conformal risk stratification</w:t>
+      </w:r>
+    </w:p>
+    <w:p>
+      <w:pPr>
+        <w:spacing w:line="360" w:lineRule="auto" w:after="120"/>
+        <w:ind w:firstLine="432"/>
+        <w:jc w:val="both"/>
+      </w:pPr>
+      <w:r>
+        <w:rPr>
+          <w:rFonts w:ascii="Times New Roman" w:hAnsi="Times New Roman"/>
+          <w:b w:val="0"/>
+          <w:i w:val="0"/>
+          <w:sz w:val="22"/>
+        </w:rPr>
+        <w:t>Class-conditional (Mondrian) conformal prediction sets tracked the target coverage within 0.2 percentage points across α ∈ {0.05, 0.10, 0.20} (empirical coverage 94.9%, 90.2% and 80.3% respectively). At α = 0.10 — corresponding to a 90% individual-patient coverage guarantee — the procedure produced a confident singleton prediction in 37% of patients: rule-out of seizure in 27% (AED-avoidance candidates) and rule-in in 11% (intensive-monitoring candidates). The remaining 63% of patients were explicitly deferred to clinical judgment with a two-class prediction set (Figure 4).</w:t>
+      </w:r>
+    </w:p>
+    <w:p>
+      <w:pPr>
+        <w:pStyle w:val="Heading2"/>
+      </w:pPr>
+      <w:r>
+        <w:rPr>
+          <w:rFonts w:ascii="Times New Roman" w:hAnsi="Times New Roman"/>
+          <w:color w:val="141F3A"/>
+        </w:rPr>
+        <w:t>Cost-effectiveness and value-of-information</w:t>
+      </w:r>
+    </w:p>
+    <w:p>
+      <w:pPr>
+        <w:spacing w:line="360" w:lineRule="auto" w:after="120"/>
+        <w:ind w:firstLine="432"/>
+        <w:jc w:val="both"/>
+      </w:pPr>
+      <w:r>
+        <w:rPr>
+          <w:rFonts w:ascii="Times New Roman" w:hAnsi="Times New Roman"/>
+          <w:b w:val="0"/>
+          <w:i w:val="0"/>
+          <w:sz w:val="22"/>
+        </w:rPr>
+        <w:t>Under base-case parameters refreshed from the 2021–2025 literature, ML-guided AED prophylaxis was the dominant strategy: lower expected cost ($4,365 vs $5,844 for observation, $5,362 for universal AED) and higher expected health (7.43 QALYs vs 7.36 and 7.42; Figure 5). ML-guided cEEG had higher expected cost ($7,685) and lower QALYs than ML-AED but remained cost-effective relative to observation in 62% of probabilistic samples at $100,000/QALY. To our knowledge this is the first value-of-information analysis applied to postoperative-seizure prophylaxis after cSDH evacuation. The per-patient expected value of perfect information at $100k/QALY was $541; the population-discounted value over 10 years and 40,000 operations per year was approximately $190 million. Strong–Oakley non-parametric regression identified per-day cEEG cost ($195 per patient EVPPI), baseline seizure prevalence ($127), AED relative-risk reduction ($96) and model sensitivity ($31) as the parameters with the largest decision-relevant information value (Figure 6).</w:t>
+      </w:r>
+    </w:p>
+    <w:p>
+      <w:r>
+        <w:br w:type="page"/>
+      </w:r>
+    </w:p>
+    <w:p>
+      <w:pPr>
+        <w:pStyle w:val="Heading1"/>
+      </w:pPr>
+      <w:r>
+        <w:rPr>
+          <w:rFonts w:ascii="Times New Roman" w:hAnsi="Times New Roman"/>
+          <w:color w:val="141F3A"/>
+        </w:rPr>
+        <w:t>Discussion</w:t>
+      </w:r>
+    </w:p>
+    <w:p>
+      <w:pPr>
+        <w:spacing w:line="360" w:lineRule="auto" w:after="120"/>
+        <w:ind w:firstLine="432"/>
+        <w:jc w:val="both"/>
+      </w:pPr>
+      <w:r>
+        <w:rPr>
+          <w:rFonts w:ascii="Times New Roman" w:hAnsi="Times New Roman"/>
+          <w:b w:val="0"/>
+          <w:i w:val="0"/>
+          <w:sz w:val="22"/>
+        </w:rPr>
+        <w:t>This proof-of-concept study demonstrates that small-cohort clinical machine learning for postoperative seizure after cSDH evacuation can be honestly deployable when calibration and individual-patient decision support — not discrimination — are treated as the optimisation target. Firth penalized logistic regression matches the published BalancedRandomForest baseline on AUC, delivers three-fold better calibration, and supports class-conditional conformal prediction sets that confidently rule out seizure in approximately one quarter of patients at a 90% coverage guarantee. Multi-database evaluation across BIDMC, eICU and NIS confirms low between-hospital heterogeneity (I² = 0%) and identifies a corrected outcome definition for future nationwide analyses.</w:t>
+      </w:r>
+    </w:p>
+    <w:p>
+      <w:pPr>
+        <w:spacing w:line="360" w:lineRule="auto" w:after="120"/>
+        <w:ind w:firstLine="432"/>
+        <w:jc w:val="both"/>
+      </w:pPr>
+      <w:r>
+        <w:rPr>
+          <w:rFonts w:ascii="Times New Roman" w:hAnsi="Times New Roman"/>
+          <w:b w:val="0"/>
+          <w:i w:val="0"/>
+          <w:sz w:val="22"/>
+        </w:rPr>
+        <w:t>The eleven-method modelling battery — spanning six SMOTE-family oversamplers, Optuna-tuned gradient boosting, diverse-base stacking, and Bayesian regression with multiple prior specifications — produced no statistically significant discrimination improvement over the baseline. This null result is concordant with three independent 2022–2025 meta-analyses showing that class-imbalance corrections do not raise AUC in clinical risk models,</w:t>
+      </w:r>
+      <w:r>
+        <w:rPr>
+          <w:rFonts w:ascii="Times New Roman" w:hAnsi="Times New Roman"/>
+          <w:b w:val="0"/>
+          <w:i w:val="0"/>
+          <w:sz w:val="22"/>
+          <w:vertAlign w:val="superscript"/>
+        </w:rPr>
+        <w:t>¹⁷⁻¹⁹</w:t>
+      </w:r>
+      <w:r>
+        <w:rPr>
+          <w:rFonts w:ascii="Times New Roman" w:hAnsi="Times New Roman"/>
+          <w:b w:val="0"/>
+          <w:i w:val="0"/>
+          <w:sz w:val="22"/>
+        </w:rPr>
+        <w:t xml:space="preserve"> and with a February-2026 head-to-head benchmark of tabular foundation models on 12 clinical tasks showing only a 16.7% win rate.</w:t>
+      </w:r>
+      <w:r>
+        <w:rPr>
+          <w:rFonts w:ascii="Times New Roman" w:hAnsi="Times New Roman"/>
+          <w:b w:val="0"/>
+          <w:i w:val="0"/>
+          <w:sz w:val="22"/>
+          <w:vertAlign w:val="superscript"/>
+        </w:rPr>
+        <w:t>²⁰</w:t>
+      </w:r>
+      <w:r>
+        <w:rPr>
+          <w:rFonts w:ascii="Times New Roman" w:hAnsi="Times New Roman"/>
+          <w:b w:val="0"/>
+          <w:i w:val="0"/>
+          <w:sz w:val="22"/>
+        </w:rPr>
+        <w:t xml:space="preserve"> The Bernoulli noise floor on 48 events places the 95% CI half-width on AUC ≈ 0.70 near 0.06; the ceiling we observe is therefore biological, not algorithmic.</w:t>
+      </w:r>
+    </w:p>
+    <w:p>
+      <w:pPr>
+        <w:spacing w:line="360" w:lineRule="auto" w:after="120"/>
+        <w:ind w:firstLine="432"/>
+        <w:jc w:val="both"/>
+      </w:pPr>
+      <w:r>
+        <w:rPr>
+          <w:rFonts w:ascii="Times New Roman" w:hAnsi="Times New Roman"/>
+          <w:b w:val="0"/>
+          <w:i w:val="0"/>
+          <w:sz w:val="22"/>
+        </w:rPr>
+        <w:t>The decision-analytic integration shows that the calibrated deployment model translates directly into clinical value. ML-guided AED prophylaxis dominated current strategies on both cost and QALY axes, and the accompanying value-of-information analysis — to our knowledge the first applied to this clinical question — quantifies the population-scale upper bound on future research investment at approximately $190 million over 10 years. Importantly, the analysis identifies *which* parameters drive the upper bound: per-day cEEG cost, baseline seizure prevalence, and AED relative-risk reduction. Each is addressable through prospective data collection or focused trials.</w:t>
+      </w:r>
+    </w:p>
+    <w:p>
+      <w:pPr>
+        <w:spacing w:line="360" w:lineRule="auto" w:after="120"/>
+        <w:ind w:firstLine="432"/>
+        <w:jc w:val="both"/>
+      </w:pPr>
+      <w:r>
+        <w:rPr>
+          <w:rFonts w:ascii="Times New Roman" w:hAnsi="Times New Roman"/>
+          <w:b w:val="0"/>
+          <w:i w:val="0"/>
+          <w:sz w:val="22"/>
+        </w:rPr>
+        <w:t>Two methodological observations bear on future cSDH research. First, the originally-reported NIS signal for postoperative seizure is driven by outcome misclassification between acute symptomatic seizure and pre-existing epilepsy; under the corrected definition, no population-scale signal remains. We release the cleaned codeset for replication. Second, cross-cohort transfer learning from eICU to BIDMC failed not for statistical reasons but because the underlying age-coefficient signs differ between mixed-acuity ICU SDH and pure post-craniotomy cSDH. Any future transfer-learning attempt in this domain must verify coefficient-sign agreement before adopting informative priors.</w:t>
+      </w:r>
+    </w:p>
+    <w:p>
+      <w:pPr>
+        <w:spacing w:line="360" w:lineRule="auto" w:after="120"/>
+        <w:ind w:firstLine="432"/>
+        <w:jc w:val="both"/>
+      </w:pPr>
+      <w:r>
+        <w:rPr>
+          <w:rFonts w:ascii="Times New Roman" w:hAnsi="Times New Roman"/>
+          <w:b w:val="0"/>
+          <w:i w:val="0"/>
+          <w:sz w:val="22"/>
+        </w:rPr>
+        <w:t>This study has limitations. The development cohort is single-institution, partly mitigated by external evaluation across 139 eICU hospitals with zero between-site heterogeneity. The structured electronic medical record lacks imaging features known to inform seizure risk; we release a regex-pattern radiology NLP feature pipeline (macro-averaged accuracy 91% on a validation set) ready for institutional radiology corpora. Outcome ascertainment is administrative rather than EEG-adjudicated; sensitivity analyses across four time-window cuts preserved the primary AUC. Cost inputs adopt the US-payer perspective; the VOI analysis explicitly identifies per-day cEEG cost as the highest-EVPPI parameter for international refinement.</w:t>
+      </w:r>
+    </w:p>
+    <w:p>
+      <w:pPr>
+        <w:spacing w:line="360" w:lineRule="auto" w:after="120"/>
+        <w:ind w:firstLine="432"/>
+        <w:jc w:val="both"/>
+      </w:pPr>
+      <w:r>
+        <w:rPr>
+          <w:rFonts w:ascii="Times New Roman" w:hAnsi="Times New Roman"/>
+          <w:b w:val="0"/>
+          <w:i w:val="0"/>
+          <w:sz w:val="22"/>
+        </w:rPr>
+        <w:t>In conclusion, calibrated, conformally-deployable machine-learning prediction of postoperative seizure after cSDH evacuation is feasible and supports individual-patient decisions with formal coverage guarantees. ML-guided AED prophylaxis dominates current strategies in a refreshed cost-effectiveness analysis, and value-of-information analysis ranks per-day cEEG cost, seizure prevalence and AED efficacy as the priority targets for future research investment.</w:t>
+      </w:r>
+    </w:p>
+    <w:p>
+      <w:r>
+        <w:br w:type="page"/>
+      </w:r>
+    </w:p>
+    <w:p>
+      <w:pPr>
+        <w:pStyle w:val="Heading1"/>
+      </w:pPr>
+      <w:r>
+        <w:rPr>
+          <w:rFonts w:ascii="Times New Roman" w:hAnsi="Times New Roman"/>
+          <w:color w:val="141F3A"/>
+        </w:rPr>
+        <w:t>References</w:t>
+      </w:r>
+    </w:p>
+    <w:p>
+      <w:pPr>
+        <w:ind w:hanging="432" w:left="432"/>
+      </w:pPr>
+      <w:r>
+        <w:rPr>
+          <w:rFonts w:ascii="Times New Roman" w:hAnsi="Times New Roman"/>
+          <w:sz w:val="20"/>
+        </w:rPr>
+        <w:t>1. Bartek J, Sjåvik K, Schaible S, et al. Long-term outcome after chronic subdural haematoma. Acta Neurochir. 2018;160(11):2275–83.</w:t>
+      </w:r>
+    </w:p>
+    <w:p>
+      <w:pPr>
+        <w:ind w:hanging="432" w:left="432"/>
+      </w:pPr>
+      <w:r>
+        <w:rPr>
+          <w:rFonts w:ascii="Times New Roman" w:hAnsi="Times New Roman"/>
+          <w:sz w:val="20"/>
+        </w:rPr>
+        <w:t>2. Brennan PM, Kolias AG, Joannides AJ, et al. Management and outcome for patients with chronic subdural haematoma. J Neurosurg. 2017;127(4):732–9.</w:t>
+      </w:r>
+    </w:p>
+    <w:p>
+      <w:pPr>
+        <w:ind w:hanging="432" w:left="432"/>
+      </w:pPr>
+      <w:r>
+        <w:rPr>
+          <w:rFonts w:ascii="Times New Roman" w:hAnsi="Times New Roman"/>
+          <w:sz w:val="20"/>
+        </w:rPr>
+        <w:t>3. Adhiyaman V, Asghar M, Ganeshram KN, et al. Chronic subdural haematoma in the elderly. Postgrad Med J. 2002;78(916):71–5.</w:t>
+      </w:r>
+    </w:p>
+    <w:p>
+      <w:pPr>
+        <w:ind w:hanging="432" w:left="432"/>
+      </w:pPr>
+      <w:r>
+        <w:rPr>
+          <w:rFonts w:ascii="Times New Roman" w:hAnsi="Times New Roman"/>
+          <w:sz w:val="20"/>
+        </w:rPr>
+        <w:t>4. Manivannan S, Khan W, Petropoulos A, et al. Seizures after chronic subdural haematoma evacuation. Front Neurol. 2023;14:1145623.</w:t>
+      </w:r>
+    </w:p>
+    <w:p>
+      <w:pPr>
+        <w:ind w:hanging="432" w:left="432"/>
+      </w:pPr>
+      <w:r>
+        <w:rPr>
+          <w:rFonts w:ascii="Times New Roman" w:hAnsi="Times New Roman"/>
+          <w:sz w:val="20"/>
+        </w:rPr>
+        <w:t>5. Chen LW, Chen ML, Lin TY, et al. Postoperative seizure after chronic subdural haematoma. Front Neurol. 2022;13:1041290.</w:t>
+      </w:r>
+    </w:p>
+    <w:p>
+      <w:pPr>
+        <w:ind w:hanging="432" w:left="432"/>
+      </w:pPr>
+      <w:r>
+        <w:rPr>
+          <w:rFonts w:ascii="Times New Roman" w:hAnsi="Times New Roman"/>
+          <w:sz w:val="20"/>
+        </w:rPr>
+        <w:t>6. Sabbagh AJ, Tubaigi SM. Seizure outcomes after surgical evacuation of subdural haematomas. Neurosurg Focus. 2018;44(4):E14.</w:t>
+      </w:r>
+    </w:p>
+    <w:p>
+      <w:pPr>
+        <w:ind w:hanging="432" w:left="432"/>
+      </w:pPr>
+      <w:r>
+        <w:rPr>
+          <w:rFonts w:ascii="Times New Roman" w:hAnsi="Times New Roman"/>
+          <w:sz w:val="20"/>
+        </w:rPr>
+        <w:t>7. Tsai HW, Lee CY, Yang CY, et al. Neuropsychiatric adverse effects in older adults following levetiracetam initiation. PMC11088830. 2024.</w:t>
+      </w:r>
+    </w:p>
+    <w:p>
+      <w:pPr>
+        <w:ind w:hanging="432" w:left="432"/>
+      </w:pPr>
+      <w:r>
+        <w:rPr>
+          <w:rFonts w:ascii="Times New Roman" w:hAnsi="Times New Roman"/>
+          <w:sz w:val="20"/>
+        </w:rPr>
+        <w:t>8. de Bresser J, et al. Perioperative levetiracetam in seizure-naïve brain tumour patients: neurocognitive outcomes. BMC Neurol. 2022;22:245.</w:t>
+      </w:r>
+    </w:p>
+    <w:p>
+      <w:pPr>
+        <w:ind w:hanging="432" w:left="432"/>
+      </w:pPr>
+      <w:r>
+        <w:rPr>
+          <w:rFonts w:ascii="Times New Roman" w:hAnsi="Times New Roman"/>
+          <w:sz w:val="20"/>
+        </w:rPr>
+        <w:t>9. Maximos M, Chang F, Patel T. AED-associated falls in ambulatory elderly. Epilepsy Res. 2017;131:25–31.</w:t>
+      </w:r>
+    </w:p>
+    <w:p>
+      <w:pPr>
+        <w:ind w:hanging="432" w:left="432"/>
+      </w:pPr>
+      <w:r>
+        <w:rPr>
+          <w:rFonts w:ascii="Times New Roman" w:hAnsi="Times New Roman"/>
+          <w:sz w:val="20"/>
+        </w:rPr>
+        <w:t>10. Liang H, et al. Perioperative levetiracetam for postoperative seizure prevention: meta-analysis. PMC11925779. 2025.</w:t>
+      </w:r>
+    </w:p>
+    <w:p>
+      <w:pPr>
+        <w:ind w:hanging="432" w:left="432"/>
+      </w:pPr>
+      <w:r>
+        <w:rPr>
+          <w:rFonts w:ascii="Times New Roman" w:hAnsi="Times New Roman"/>
+          <w:sz w:val="20"/>
+        </w:rPr>
+        <w:t>11. Vespa PM, Olson DM, John S, et al. Evaluating the clinical impact of rapid-response electroencephalography (DECIDE). Crit Care Med. 2020;48(9):1249–57.</w:t>
+      </w:r>
+    </w:p>
+    <w:p>
+      <w:pPr>
+        <w:ind w:hanging="432" w:left="432"/>
+      </w:pPr>
+      <w:r>
+        <w:rPr>
+          <w:rFonts w:ascii="Times New Roman" w:hAnsi="Times New Roman"/>
+          <w:sz w:val="20"/>
+        </w:rPr>
+        <w:t>12. Parvizi J, Cole AJ, Hirsch LJ. Economic value of rapid-EEG. J Med Econ. 2021;24(1):318–26.</w:t>
+      </w:r>
+    </w:p>
+    <w:p>
+      <w:pPr>
+        <w:ind w:hanging="432" w:left="432"/>
+      </w:pPr>
+      <w:r>
+        <w:rPr>
+          <w:rFonts w:ascii="Times New Roman" w:hAnsi="Times New Roman"/>
+          <w:sz w:val="20"/>
+        </w:rPr>
+        <w:t>13. Kamousi B, Vespa P, Hirsch LJ, et al. Multicenter rapid-EEG vs conventional EEG seizure capture. Front Neurol. 2022;13:937515.</w:t>
+      </w:r>
+    </w:p>
+    <w:p>
+      <w:pPr>
+        <w:ind w:hanging="432" w:left="432"/>
+      </w:pPr>
+      <w:r>
+        <w:rPr>
+          <w:rFonts w:ascii="Times New Roman" w:hAnsi="Times New Roman"/>
+          <w:sz w:val="20"/>
+        </w:rPr>
+        <w:t>14. Mohammadi M, Habibzadeh F, Smith J. Machine-learning prediction of seizure after cSDH: pilot. Cureus. 2021;13:e1234. [example placeholder]</w:t>
+      </w:r>
+    </w:p>
+    <w:p>
+      <w:pPr>
+        <w:ind w:hanging="432" w:left="432"/>
+      </w:pPr>
+      <w:r>
+        <w:rPr>
+          <w:rFonts w:ascii="Times New Roman" w:hAnsi="Times New Roman"/>
+          <w:sz w:val="20"/>
+        </w:rPr>
+        <w:t>15. Cohen JT, Patel A, Smith P. Random-forest seizure prediction in neurocritical care. JAMIA. 2020;27(6):987–95. [example placeholder]</w:t>
+      </w:r>
+    </w:p>
+    <w:p>
+      <w:pPr>
+        <w:ind w:hanging="432" w:left="432"/>
+      </w:pPr>
+      <w:r>
+        <w:rPr>
+          <w:rFonts w:ascii="Times New Roman" w:hAnsi="Times New Roman"/>
+          <w:sz w:val="20"/>
+        </w:rPr>
+        <w:t>16. Singh A, Brown B, Garcia D. Limitations of single-centre ML models in neurosurgery. NeurosurgFocus. 2022;52(4):E10. [example placeholder]</w:t>
+      </w:r>
+    </w:p>
+    <w:p>
+      <w:pPr>
+        <w:ind w:hanging="432" w:left="432"/>
+      </w:pPr>
+      <w:r>
+        <w:rPr>
+          <w:rFonts w:ascii="Times New Roman" w:hAnsi="Times New Roman"/>
+          <w:sz w:val="20"/>
+        </w:rPr>
+        <w:t>17. van den Goorbergh R, et al. The harm of class-imbalance corrections for risk prediction. JAMIA. 2022;29(9):1525–34.</w:t>
+      </w:r>
+    </w:p>
+    <w:p>
+      <w:pPr>
+        <w:ind w:hanging="432" w:left="432"/>
+      </w:pPr>
+      <w:r>
+        <w:rPr>
+          <w:rFonts w:ascii="Times New Roman" w:hAnsi="Times New Roman"/>
+          <w:sz w:val="20"/>
+        </w:rPr>
+        <w:t>18. Carriero J, et al. Tipping the Balance: class imbalance corrections in clinical prediction. arXiv:2404.19494. 2024.</w:t>
+      </w:r>
+    </w:p>
+    <w:p>
+      <w:pPr>
+        <w:ind w:hanging="432" w:left="432"/>
+      </w:pPr>
+      <w:r>
+        <w:rPr>
+          <w:rFonts w:ascii="Times New Roman" w:hAnsi="Times New Roman"/>
+          <w:sz w:val="20"/>
+        </w:rPr>
+        <w:t>19. Piccininni M, Wechsung M, Van Calster B. Random resampling and calibration. J Biomed Inform. 2024;155:104666.</w:t>
+      </w:r>
+    </w:p>
+    <w:p>
+      <w:pPr>
+        <w:ind w:hanging="432" w:left="432"/>
+      </w:pPr>
+      <w:r>
+        <w:rPr>
+          <w:rFonts w:ascii="Times New Roman" w:hAnsi="Times New Roman"/>
+          <w:sz w:val="20"/>
+        </w:rPr>
+        <w:t>20. Anonymous. Tabular foundation models in clinical predictions: head-to-head benchmark. medRxiv. 2026; doi:10.64898/2026.02.02.26345274v1.</w:t>
+      </w:r>
+    </w:p>
+    <w:p>
+      <w:pPr>
+        <w:ind w:hanging="432" w:left="432"/>
+      </w:pPr>
+      <w:r>
+        <w:rPr>
+          <w:rFonts w:ascii="Times New Roman" w:hAnsi="Times New Roman"/>
+          <w:sz w:val="20"/>
+        </w:rPr>
+        <w:t>21. Hollmann N, et al. Accurate predictions on small data with a tabular foundation model. Nature. 2025;637:319–26.</w:t>
+      </w:r>
+    </w:p>
+    <w:p>
+      <w:pPr>
+        <w:ind w:hanging="432" w:left="432"/>
+      </w:pPr>
+      <w:r>
+        <w:rPr>
+          <w:rFonts w:ascii="Times New Roman" w:hAnsi="Times New Roman"/>
+          <w:sz w:val="20"/>
+        </w:rPr>
+        <w:t>22. Collins GS, Moons KGM, Dhiman P, et al. TRIPOD+AI statement. BMJ. 2024;385:e078378.</w:t>
+      </w:r>
+    </w:p>
+    <w:p>
+      <w:pPr>
+        <w:ind w:hanging="432" w:left="432"/>
+      </w:pPr>
+      <w:r>
+        <w:rPr>
+          <w:rFonts w:ascii="Times New Roman" w:hAnsi="Times New Roman"/>
+          <w:sz w:val="20"/>
+        </w:rPr>
+        <w:t>23. Vovk V, Gammerman A, Shafer G. Algorithmic Learning in a Random World. Springer; 2005.</w:t>
+      </w:r>
+    </w:p>
+    <w:p>
+      <w:pPr>
+        <w:ind w:hanging="432" w:left="432"/>
+      </w:pPr>
+      <w:r>
+        <w:rPr>
+          <w:rFonts w:ascii="Times New Roman" w:hAnsi="Times New Roman"/>
+          <w:sz w:val="20"/>
+        </w:rPr>
+        <w:t>24. Angelopoulos AN, Bates S. A gentle introduction to conformal prediction. arXiv:2107.07511. 2021.</w:t>
+      </w:r>
+    </w:p>
+    <w:p>
+      <w:pPr>
+        <w:ind w:hanging="432" w:left="432"/>
+      </w:pPr>
+      <w:r>
+        <w:rPr>
+          <w:rFonts w:ascii="Times New Roman" w:hAnsi="Times New Roman"/>
+          <w:sz w:val="20"/>
+        </w:rPr>
+        <w:t>25. Neumann PJ, Cohen JT, Weinstein MC. Updating cost-effectiveness — the curious resilience of the $50,000-per-QALY threshold. N Engl J Med. 2014;371:796–7.</w:t>
+      </w:r>
+    </w:p>
+    <w:p>
+      <w:pPr>
+        <w:ind w:hanging="432" w:left="432"/>
+      </w:pPr>
+      <w:r>
+        <w:rPr>
+          <w:rFonts w:ascii="Times New Roman" w:hAnsi="Times New Roman"/>
+          <w:sz w:val="20"/>
+        </w:rPr>
+        <w:t>26. Vanness DJ, Lomas J, Ahn H. A health opportunity-cost approach to US CEA. Ann Intern Med. 2021;174(1):25–32.</w:t>
+      </w:r>
+    </w:p>
+    <w:p>
+      <w:pPr>
+        <w:ind w:hanging="432" w:left="432"/>
+      </w:pPr>
+      <w:r>
+        <w:rPr>
+          <w:rFonts w:ascii="Times New Roman" w:hAnsi="Times New Roman"/>
+          <w:sz w:val="20"/>
+        </w:rPr>
+        <w:t>27. Crespo C, Monleón A, Díaz W, et al. CE thresholds used by study authors, 1990–2021. Value Health. 2023.</w:t>
+      </w:r>
+    </w:p>
+    <w:p>
+      <w:pPr>
+        <w:ind w:hanging="432" w:left="432"/>
+      </w:pPr>
+      <w:r>
+        <w:rPr>
+          <w:rFonts w:ascii="Times New Roman" w:hAnsi="Times New Roman"/>
+          <w:sz w:val="20"/>
+        </w:rPr>
+        <w:t>28. Strong M, Oakley JE, Brennan A. Estimating EVPPI using non-parametric regression. Med Decis Making. 2014;34(3):311–26.</w:t>
+      </w:r>
+    </w:p>
+    <w:p>
+      <w:pPr>
+        <w:ind w:hanging="432" w:left="432"/>
+      </w:pPr>
+      <w:r>
+        <w:rPr>
+          <w:rFonts w:ascii="Times New Roman" w:hAnsi="Times New Roman"/>
+          <w:sz w:val="20"/>
+        </w:rPr>
+        <w:t>29. Heath A, Manolopoulou I, Baio G. Estimating expected value of partial perfect information via SPDE-INLA. Stat Med. 2018;37(7):1093–113.</w:t>
+      </w:r>
+    </w:p>
+    <w:p>
+      <w:pPr>
+        <w:ind w:hanging="432" w:left="432"/>
+      </w:pPr>
+      <w:r>
+        <w:rPr>
+          <w:rFonts w:ascii="Times New Roman" w:hAnsi="Times New Roman"/>
+          <w:sz w:val="20"/>
+        </w:rPr>
+        <w:t>30. Pollard TJ, Johnson AEW, Raffa JD, et al. The eICU Collaborative Research Database. Sci Data. 2018;5:180178.</w:t>
+      </w:r>
+    </w:p>
+    <w:p>
+      <w:pPr>
+        <w:ind w:hanging="432" w:left="432"/>
+      </w:pPr>
+      <w:r>
+        <w:rPr>
+          <w:rFonts w:ascii="Times New Roman" w:hAnsi="Times New Roman"/>
+          <w:sz w:val="20"/>
+        </w:rPr>
+        <w:t>31. Johnson AEW, Bulgarelli L, Shen L, et al. MIMIC-IV, a freely accessible electronic health record dataset. Sci Data. 2023;10:1.</w:t>
+      </w:r>
+    </w:p>
+    <w:p>
+      <w:pPr>
+        <w:ind w:hanging="432" w:left="432"/>
+      </w:pPr>
+      <w:r>
+        <w:rPr>
+          <w:rFonts w:ascii="Times New Roman" w:hAnsi="Times New Roman"/>
+          <w:sz w:val="20"/>
+        </w:rPr>
+        <w:t>32. Chawla NV, Bowyer KW, Hall LO, Kegelmeyer WP. SMOTE. J Artif Intell Res. 2002;16:321–57.</w:t>
+      </w:r>
+    </w:p>
+    <w:p>
+      <w:pPr>
+        <w:ind w:hanging="432" w:left="432"/>
+      </w:pPr>
+      <w:r>
+        <w:rPr>
+          <w:rFonts w:ascii="Times New Roman" w:hAnsi="Times New Roman"/>
+          <w:sz w:val="20"/>
+        </w:rPr>
+        <w:t>33. Han H, Wang W, Mao B. Borderline-SMOTE. ICIC. 2005;3644:878–87.</w:t>
+      </w:r>
+    </w:p>
+    <w:p>
+      <w:pPr>
+        <w:ind w:hanging="432" w:left="432"/>
+      </w:pPr>
+      <w:r>
+        <w:rPr>
+          <w:rFonts w:ascii="Times New Roman" w:hAnsi="Times New Roman"/>
+          <w:sz w:val="20"/>
+        </w:rPr>
+        <w:t>34. Nguyen HM, Cooper EW, Kamei K. SVM-SMOTE. Int J Knowl Eng Soft Data Paradigms. 2011;3:4–21.</w:t>
+      </w:r>
+    </w:p>
+    <w:p>
+      <w:pPr>
+        <w:ind w:hanging="432" w:left="432"/>
+      </w:pPr>
+      <w:r>
+        <w:rPr>
+          <w:rFonts w:ascii="Times New Roman" w:hAnsi="Times New Roman"/>
+          <w:sz w:val="20"/>
+        </w:rPr>
+        <w:t>35. Firth D. Bias reduction of maximum likelihood estimates. Biometrika. 1993;80(1):27–38.</w:t>
+      </w:r>
+    </w:p>
+    <w:p>
+      <w:pPr>
+        <w:ind w:hanging="432" w:left="432"/>
+      </w:pPr>
+      <w:r>
+        <w:rPr>
+          <w:rFonts w:ascii="Times New Roman" w:hAnsi="Times New Roman"/>
+          <w:sz w:val="20"/>
+        </w:rPr>
+        <w:t>36. Puhr R, Heinze G, Nold M, Lusa L, Geroldinger A. Firth's logistic regression with rare events. Stat Med. 2017;36(14):2302–17.</w:t>
+      </w:r>
+    </w:p>
+    <w:p>
+      <w:pPr>
+        <w:ind w:hanging="432" w:left="432"/>
+      </w:pPr>
+      <w:r>
+        <w:rPr>
+          <w:rFonts w:ascii="Times New Roman" w:hAnsi="Times New Roman"/>
+          <w:sz w:val="20"/>
+        </w:rPr>
+        <w:t>37. DerSimonian R, Laird N. Meta-analysis in clinical trials. Control Clin Trials. 1986;7(3):177–88.</w:t>
+      </w:r>
+    </w:p>
+    <w:p>
+      <w:pPr>
+        <w:ind w:hanging="432" w:left="432"/>
+      </w:pPr>
+      <w:r>
+        <w:rPr>
+          <w:rFonts w:ascii="Times New Roman" w:hAnsi="Times New Roman"/>
+          <w:sz w:val="20"/>
+        </w:rPr>
+        <w:t>38. Geskus RB. Cause-specific cumulative incidence estimation under competing risks (IPCW). Biometrics. 2011;67:39–49.</w:t>
+      </w:r>
+    </w:p>
+    <w:p>
+      <w:r>
+        <w:br w:type="page"/>
+      </w:r>
+    </w:p>
+    <w:p>
+      <w:pPr>
+        <w:pStyle w:val="Heading1"/>
+      </w:pPr>
+      <w:r>
+        <w:rPr>
+          <w:rFonts w:ascii="Times New Roman" w:hAnsi="Times New Roman"/>
+          <w:color w:val="141F3A"/>
+        </w:rPr>
+        <w:t>Tables and Figures</w:t>
+      </w:r>
+    </w:p>
+    <w:p>
+      <w:pPr>
+        <w:spacing w:line="360" w:lineRule="auto" w:after="120"/>
+        <w:jc w:val="both"/>
+      </w:pPr>
+      <w:r>
+        <w:rPr>
+          <w:rFonts w:ascii="Times New Roman" w:hAnsi="Times New Roman"/>
+          <w:b w:val="0"/>
+          <w:i/>
+          <w:sz w:val="22"/>
+        </w:rPr>
+        <w:t>Per journal-submission convention, all tables and figures with their full legends are collected at the end of the manuscript rather than placed inline.</w:t>
+      </w:r>
+    </w:p>
+    <w:p>
+      <w:pPr>
+        <w:pStyle w:val="Heading2"/>
+      </w:pPr>
+      <w:r>
+        <w:rPr>
+          <w:rFonts w:ascii="Times New Roman" w:hAnsi="Times New Roman"/>
+          <w:color w:val="141F3A"/>
+        </w:rPr>
+        <w:t>Tables</w:t>
       </w:r>
     </w:p>
     <w:p>
@@ -1432,20 +2275,7 @@
     </w:tbl>
     <w:p>
       <w:pPr>
-        <w:pStyle w:val="Heading2"/>
-      </w:pPr>
-      <w:r>
-        <w:rPr>
-          <w:rFonts w:ascii="Times New Roman" w:hAnsi="Times New Roman"/>
-          <w:color w:val="141F3A"/>
-        </w:rPr>
-        <w:t>Primary discrimination performance</w:t>
-      </w:r>
-    </w:p>
-    <w:p>
-      <w:pPr>
         <w:spacing w:line="360" w:lineRule="auto" w:after="120"/>
-        <w:ind w:firstLine="432"/>
         <w:jc w:val="both"/>
       </w:pPr>
       <w:r>
@@ -1455,17 +2285,28 @@
           <w:i w:val="0"/>
           <w:sz w:val="22"/>
         </w:rPr>
-        <w:t>On BIDMC, Firth penalized logistic regression produced a 25-fold cross-validated AUC of 0.681 (95% CI 0.609–0.753), within noise of the published BalancedRandomForest reference (0.676; 0.595–0.760; DeLong p = 0.81). Removing three variables that could in principle be charted after seizure onset (postoperative-B) yielded AUC 0.645; the primary signal does not require post-event information. External validation in the eICU non-traumatic cohort gave AUC 0.750 (0.711–0.774); leave-one-hospital-out random-effects pooling across 42 hospitals yielded AUC 0.684 (0.651–0.714), with τ² ≈ 0 and I² = 0% (Figure 1).</w:t>
       </w:r>
     </w:p>
     <w:p>
       <w:pPr>
+        <w:pStyle w:val="Heading2"/>
+      </w:pPr>
+      <w:r>
+        <w:rPr>
+          <w:rFonts w:ascii="Times New Roman" w:hAnsi="Times New Roman"/>
+          <w:color w:val="141F3A"/>
+        </w:rPr>
+        <w:t>Figures</w:t>
+      </w:r>
+    </w:p>
+    <w:p>
+      <w:pPr>
         <w:jc w:val="center"/>
       </w:pPr>
       <w:r>
         <w:drawing>
           <wp:inline xmlns:a="http://schemas.openxmlformats.org/drawingml/2006/main" xmlns:pic="http://schemas.openxmlformats.org/drawingml/2006/picture">
-            <wp:extent cx="5943600" cy="3952671"/>
+            <wp:extent cx="5943600" cy="4463563"/>
             <wp:docPr id="1" name="Picture 1"/>
             <wp:cNvGraphicFramePr>
               <a:graphicFrameLocks noChangeAspect="1"/>
@@ -1486,7 +2327,7 @@
                   <pic:spPr>
                     <a:xfrm>
                       <a:off x="0" y="0"/>
-                      <a:ext cx="5943600" cy="3952671"/>
+                      <a:ext cx="5943600" cy="4463563"/>
                     </a:xfrm>
                     <a:prstGeom prst="rect"/>
                   </pic:spPr>
@@ -1507,25 +2348,12 @@
           <w:i/>
           <w:sz w:val="20"/>
         </w:rPr>
-        <w:t>Figure 1.  Multi-database discrimination. A — BIDMC primary cohort: Firth penalized LR and BalancedRandomForest with bootstrap 95% CIs. B — eICU leave-one-hospital-out random-effects pooled estimates (DerSimonian–Laird) across cohort × feature-set combinations. C — Temporal-leakage audit: the strict pre-seizure feature subset (green) preserves discrimination in the full eICU cohort.</w:t>
+        <w:t>Figure 1.  Multi-database discrimination. A — BIDMC primary cohort: Firth penalized logistic regression and BalancedRandomForest with bootstrap 95% CIs. B — eICU leave-one-hospital-out random-effects pooled estimates (DerSimonian–Laird) across cohort × feature-set combinations. C — Temporal-leakage audit: the strict pre-seizure feature subset (green) preserves discrimination in the full eICU cohort.</w:t>
       </w:r>
     </w:p>
     <w:p>
       <w:pPr>
-        <w:pStyle w:val="Heading2"/>
-      </w:pPr>
-      <w:r>
-        <w:rPr>
-          <w:rFonts w:ascii="Times New Roman" w:hAnsi="Times New Roman"/>
-          <w:color w:val="141F3A"/>
-        </w:rPr>
-        <w:t>Calibration and clinical utility</w:t>
-      </w:r>
-    </w:p>
-    <w:p>
-      <w:pPr>
         <w:spacing w:line="360" w:lineRule="auto" w:after="120"/>
-        <w:ind w:firstLine="432"/>
         <w:jc w:val="both"/>
       </w:pPr>
       <w:r>
@@ -1535,7 +2363,6 @@
           <w:i w:val="0"/>
           <w:sz w:val="22"/>
         </w:rPr>
-        <w:t>Pre-recalibration, class-rebalanced classifiers assigned probabilities that were too extreme (eICU Set C: Brier 0.071, calibration slope 1.51). Cross-validated Platt scaling brought slope to within 0.99–1.04 in every model and calibration-in-the-large to |CITL| ≤ 0.03. Decision-curve net benefit was positive across the 5–15% probability-threshold band — the range that brackets clinically reasonable thresholds for AED prophylaxis or selective monitoring (Figure 2).</w:t>
       </w:r>
     </w:p>
     <w:p>
@@ -1545,7 +2372,7 @@
       <w:r>
         <w:drawing>
           <wp:inline xmlns:a="http://schemas.openxmlformats.org/drawingml/2006/main" xmlns:pic="http://schemas.openxmlformats.org/drawingml/2006/picture">
-            <wp:extent cx="5943600" cy="3418066"/>
+            <wp:extent cx="5943600" cy="3464082"/>
             <wp:docPr id="2" name="Picture 2"/>
             <wp:cNvGraphicFramePr>
               <a:graphicFrameLocks noChangeAspect="1"/>
@@ -1566,7 +2393,7 @@
                   <pic:spPr>
                     <a:xfrm>
                       <a:off x="0" y="0"/>
-                      <a:ext cx="5943600" cy="3418066"/>
+                      <a:ext cx="5943600" cy="3464082"/>
                     </a:xfrm>
                     <a:prstGeom prst="rect"/>
                   </pic:spPr>
@@ -1592,20 +2419,7 @@
     </w:p>
     <w:p>
       <w:pPr>
-        <w:pStyle w:val="Heading2"/>
-      </w:pPr>
-      <w:r>
-        <w:rPr>
-          <w:rFonts w:ascii="Times New Roman" w:hAnsi="Times New Roman"/>
-          <w:color w:val="141F3A"/>
-        </w:rPr>
-        <w:t>Eleven-method modelling battery</w:t>
-      </w:r>
-    </w:p>
-    <w:p>
-      <w:pPr>
         <w:spacing w:line="360" w:lineRule="auto" w:after="120"/>
-        <w:ind w:firstLine="432"/>
         <w:jc w:val="both"/>
       </w:pPr>
       <w:r>
@@ -1615,26 +2429,6 @@
           <w:i w:val="0"/>
           <w:sz w:val="22"/>
         </w:rPr>
-        <w:t>Across eleven model classes, AUC was insensitive to method selection (range 0.62–0.69; all DeLong tests against baseline p &gt; 0.05 or p &lt; 0.05 with worse discrimination), confirming the discrimination ceiling at n = 48 events implied by the Bernoulli noise floor and consistent with recent meta-evidence.</w:t>
-      </w:r>
-      <w:r>
-        <w:rPr>
-          <w:rFonts w:ascii="Times New Roman" w:hAnsi="Times New Roman"/>
-          <w:b w:val="0"/>
-          <w:i w:val="0"/>
-          <w:sz w:val="22"/>
-          <w:vertAlign w:val="superscript"/>
-        </w:rPr>
-        <w:t>¹⁷⁻¹⁹</w:t>
-      </w:r>
-      <w:r>
-        <w:rPr>
-          <w:rFonts w:ascii="Times New Roman" w:hAnsi="Times New Roman"/>
-          <w:b w:val="0"/>
-          <w:i w:val="0"/>
-          <w:sz w:val="22"/>
-        </w:rPr>
-        <w:t xml:space="preserve"> Calibration, by contrast, varied substantially across methods: Brier score ranged from 0.067 (Firth and stacking) to 0.228 (BalancedRandomForest baseline) — a more-than-threefold difference (Figure 3). Bayesian regression with eICU-informed priors significantly degraded discrimination (AUC 0.515, DeLong p = 0.001) because the eICU age coefficient is negative in mixed-acuity ICU SDH while pure post-craniotomy cSDH shows a positive age effect — a biological mismatch warning for any future transfer-learning between these populations.</w:t>
       </w:r>
     </w:p>
     <w:p>
@@ -1644,7 +2438,7 @@
       <w:r>
         <w:drawing>
           <wp:inline xmlns:a="http://schemas.openxmlformats.org/drawingml/2006/main" xmlns:pic="http://schemas.openxmlformats.org/drawingml/2006/picture">
-            <wp:extent cx="5943600" cy="2805089"/>
+            <wp:extent cx="5943600" cy="3981166"/>
             <wp:docPr id="3" name="Picture 3"/>
             <wp:cNvGraphicFramePr>
               <a:graphicFrameLocks noChangeAspect="1"/>
@@ -1665,7 +2459,7 @@
                   <pic:spPr>
                     <a:xfrm>
                       <a:off x="0" y="0"/>
-                      <a:ext cx="5943600" cy="2805089"/>
+                      <a:ext cx="5943600" cy="3981166"/>
                     </a:xfrm>
                     <a:prstGeom prst="rect"/>
                   </pic:spPr>
@@ -1686,25 +2480,12 @@
           <w:i/>
           <w:sz w:val="20"/>
         </w:rPr>
-        <w:t>Figure 3.  Eleven-method modelling battery on BIDMC postoperative-A. A — Cross-validated AUC with bootstrap 95% CIs across model classes converge near 0.68. B — Brier score across the same models. The Firth penalized LR deployment model (orange) matches discrimination of every well-behaved alternative while delivering threefold-better calibration than the BalancedRandomForest baseline (navy).</w:t>
+        <w:t>Figure 3.  Eleven-method modelling battery on BIDMC postoperative-A. A — Cross-validated AUC with bootstrap 95% CIs across model classes converge near 0.68. B — Brier score across the same models. The Firth penalized logistic regression deployment model (rust) matches discrimination of every well-behaved alternative while delivering threefold-better calibration than the BalancedRandomForest baseline (navy).</w:t>
       </w:r>
     </w:p>
     <w:p>
       <w:pPr>
-        <w:pStyle w:val="Heading2"/>
-      </w:pPr>
-      <w:r>
-        <w:rPr>
-          <w:rFonts w:ascii="Times New Roman" w:hAnsi="Times New Roman"/>
-          <w:color w:val="141F3A"/>
-        </w:rPr>
-        <w:t>Conformal risk stratification</w:t>
-      </w:r>
-    </w:p>
-    <w:p>
-      <w:pPr>
         <w:spacing w:line="360" w:lineRule="auto" w:after="120"/>
-        <w:ind w:firstLine="432"/>
         <w:jc w:val="both"/>
       </w:pPr>
       <w:r>
@@ -1714,7 +2495,6 @@
           <w:i w:val="0"/>
           <w:sz w:val="22"/>
         </w:rPr>
-        <w:t>Class-conditional (Mondrian) conformal prediction sets tracked the target coverage within 0.2 percentage points across α ∈ {0.05, 0.10, 0.20} (empirical coverage 94.9%, 90.2% and 80.3% respectively). At α = 0.10 — corresponding to a 90% individual-patient coverage guarantee — the procedure produced a confident singleton prediction in 37% of patients: rule-out of seizure in 27% (AED-avoidance candidates) and rule-in in 11% (intensive-monitoring candidates). The remaining 63% of patients were explicitly deferred to clinical judgment with a two-class prediction set (Figure 4).</w:t>
       </w:r>
     </w:p>
     <w:p>
@@ -1724,7 +2504,7 @@
       <w:r>
         <w:drawing>
           <wp:inline xmlns:a="http://schemas.openxmlformats.org/drawingml/2006/main" xmlns:pic="http://schemas.openxmlformats.org/drawingml/2006/picture">
-            <wp:extent cx="5943600" cy="2751286"/>
+            <wp:extent cx="5943600" cy="3188510"/>
             <wp:docPr id="4" name="Picture 4"/>
             <wp:cNvGraphicFramePr>
               <a:graphicFrameLocks noChangeAspect="1"/>
@@ -1745,7 +2525,7 @@
                   <pic:spPr>
                     <a:xfrm>
                       <a:off x="0" y="0"/>
-                      <a:ext cx="5943600" cy="2751286"/>
+                      <a:ext cx="5943600" cy="3188510"/>
                     </a:xfrm>
                     <a:prstGeom prst="rect"/>
                   </pic:spPr>
@@ -1766,25 +2546,12 @@
           <w:i/>
           <w:sz w:val="20"/>
         </w:rPr>
-        <w:t>Figure 4.  Class-conditional conformal prediction. A — Empirical coverage tracks the target 1−α. B — Rule-out and rule-in singleton fractions versus α; at α = 0.10 the procedure delivers confident decisions for 37% of patients.</w:t>
+        <w:t>Figure 4.  Class-conditional conformal prediction. A — Empirical coverage tracks the target 1−α across α ∈ {0.05, 0.10, 0.20}. B — Rule-out and rule-in singleton fractions versus α; at α = 0.10 the procedure delivers confident decisions for 37% of patients (rule-out 27%, rule-in 11%).</w:t>
       </w:r>
     </w:p>
     <w:p>
       <w:pPr>
-        <w:pStyle w:val="Heading2"/>
-      </w:pPr>
-      <w:r>
-        <w:rPr>
-          <w:rFonts w:ascii="Times New Roman" w:hAnsi="Times New Roman"/>
-          <w:color w:val="141F3A"/>
-        </w:rPr>
-        <w:t>Cost-effectiveness and value-of-information</w:t>
-      </w:r>
-    </w:p>
-    <w:p>
-      <w:pPr>
         <w:spacing w:line="360" w:lineRule="auto" w:after="120"/>
-        <w:ind w:firstLine="432"/>
         <w:jc w:val="both"/>
       </w:pPr>
       <w:r>
@@ -1794,7 +2561,6 @@
           <w:i w:val="0"/>
           <w:sz w:val="22"/>
         </w:rPr>
-        <w:t>Under base-case parameters refreshed from the 2021–2025 literature, ML-guided AED prophylaxis was the dominant strategy: lower expected cost ($4,365 vs $5,844 for observation, $5,362 for universal AED) and higher expected health (7.43 QALYs vs 7.36 and 7.42; Figure 5). ML-guided cEEG had higher expected cost ($7,685) and lower QALYs than ML-AED but remained cost-effective relative to observation in 62% of probabilistic samples at $100,000/QALY. To our knowledge this is the first value-of-information analysis applied to postoperative-seizure prophylaxis after cSDH evacuation. The per-patient expected value of perfect information at $100k/QALY was $541; the population-discounted value over 10 years and 40,000 operations per year was approximately $190 million. Strong–Oakley non-parametric regression identified per-day cEEG cost ($195 per patient EVPPI), baseline seizure prevalence ($127), AED relative-risk reduction ($96) and model sensitivity ($31) as the parameters with the largest decision-relevant information value (Figure 6).</w:t>
       </w:r>
     </w:p>
     <w:p>
@@ -1804,7 +2570,7 @@
       <w:r>
         <w:drawing>
           <wp:inline xmlns:a="http://schemas.openxmlformats.org/drawingml/2006/main" xmlns:pic="http://schemas.openxmlformats.org/drawingml/2006/picture">
-            <wp:extent cx="5943600" cy="4669560"/>
+            <wp:extent cx="5943600" cy="7056264"/>
             <wp:docPr id="5" name="Picture 5"/>
             <wp:cNvGraphicFramePr>
               <a:graphicFrameLocks noChangeAspect="1"/>
@@ -1825,7 +2591,7 @@
                   <pic:spPr>
                     <a:xfrm>
                       <a:off x="0" y="0"/>
-                      <a:ext cx="5943600" cy="4669560"/>
+                      <a:ext cx="5943600" cy="7056264"/>
                     </a:xfrm>
                     <a:prstGeom prst="rect"/>
                   </pic:spPr>
@@ -1846,17 +2612,31 @@
           <w:i/>
           <w:sz w:val="20"/>
         </w:rPr>
-        <w:t>Figure 5.  Cost-effectiveness analysis. A — Decision tree with base-case rollback per strategy. B — Cost-effectiveness plane from 10,000-iteration PSA. C — Cost-effectiveness acceptability curves over willingness-to-pay.</w:t>
+        <w:t>Figure 5.  Cost-effectiveness analysis. A — Decision tree with base-case rollback per strategy. B — Cost-effectiveness plane from 10,000-iteration probabilistic sensitivity. C — Cost-effectiveness acceptability curves over willingness-to-pay.</w:t>
       </w:r>
     </w:p>
     <w:p>
       <w:pPr>
+        <w:spacing w:line="360" w:lineRule="auto" w:after="120"/>
+        <w:jc w:val="both"/>
+      </w:pPr>
+      <w:r>
+        <w:rPr>
+          <w:rFonts w:ascii="Times New Roman" w:hAnsi="Times New Roman"/>
+          <w:b w:val="0"/>
+          <w:i w:val="0"/>
+          <w:sz w:val="22"/>
+        </w:rPr>
+      </w:r>
+    </w:p>
+    <w:p>
+      <w:pPr>
         <w:jc w:val="center"/>
       </w:pPr>
       <w:r>
         <w:drawing>
           <wp:inline xmlns:a="http://schemas.openxmlformats.org/drawingml/2006/main" xmlns:pic="http://schemas.openxmlformats.org/drawingml/2006/picture">
-            <wp:extent cx="5943600" cy="2944003"/>
+            <wp:extent cx="5943600" cy="3314088"/>
             <wp:docPr id="6" name="Picture 6"/>
             <wp:cNvGraphicFramePr>
               <a:graphicFrameLocks noChangeAspect="1"/>
@@ -1877,7 +2657,7 @@
                   <pic:spPr>
                     <a:xfrm>
                       <a:off x="0" y="0"/>
-                      <a:ext cx="5943600" cy="2944003"/>
+                      <a:ext cx="5943600" cy="3314088"/>
                     </a:xfrm>
                     <a:prstGeom prst="rect"/>
                   </pic:spPr>
@@ -1898,25 +2678,12 @@
           <w:i/>
           <w:sz w:val="20"/>
         </w:rPr>
-        <w:t>Figure 6.  Value of information. Per-parameter EVPPI tornado at WTP $100k/QALY (left) and per-patient EVPI as a function of WTP threshold (right). The four parameters with the largest EVPPI define the research-priority frontier.</w:t>
+        <w:t>Figure 6.  Value of information. A — Per-parameter EVPPI tornado at WTP $100,000/QALY; the four highlighted parameters define the research-priority frontier. B — Per-patient EVPI as a function of willingness-to-pay threshold.</w:t>
       </w:r>
     </w:p>
     <w:p>
       <w:pPr>
-        <w:pStyle w:val="Heading2"/>
-      </w:pPr>
-      <w:r>
-        <w:rPr>
-          <w:rFonts w:ascii="Times New Roman" w:hAnsi="Times New Roman"/>
-          <w:color w:val="141F3A"/>
-        </w:rPr>
-        <w:t>Methodological corrections (NIS outcome and transfer learning)</w:t>
-      </w:r>
-    </w:p>
-    <w:p>
-      <w:pPr>
         <w:spacing w:line="360" w:lineRule="auto" w:after="120"/>
-        <w:ind w:firstLine="432"/>
         <w:jc w:val="both"/>
       </w:pPr>
       <w:r>
@@ -1926,631 +2693,6 @@
           <w:i w:val="0"/>
           <w:sz w:val="22"/>
         </w:rPr>
-        <w:t>A nationwide reanalysis identified a conflation between ICD-10-CM acute symptomatic seizure codes and pre-existing epilepsy codes in the original NIS outcome definition. Combining both code families inflated the event rate 2.3-fold and produced an L2-regularized logistic-regression AUC of 0.617. Restricting the outcome to acute symptomatic seizure alone collapsed discrimination to 0.498 under L1, L2, group-LASSO with cross-validated λ-path tuning and sparse-group-LASSO; the previously-reported population-scale signal disappears under the corrected definition (Supplementary Figure S5). The cleaned outcome definition and reproducibility code are released on GitHub.</w:t>
-      </w:r>
-    </w:p>
-    <w:p>
-      <w:r>
-        <w:br w:type="page"/>
-      </w:r>
-    </w:p>
-    <w:p>
-      <w:pPr>
-        <w:pStyle w:val="Heading1"/>
-      </w:pPr>
-      <w:r>
-        <w:rPr>
-          <w:rFonts w:ascii="Times New Roman" w:hAnsi="Times New Roman"/>
-          <w:color w:val="141F3A"/>
-        </w:rPr>
-        <w:t>Discussion</w:t>
-      </w:r>
-    </w:p>
-    <w:p>
-      <w:pPr>
-        <w:spacing w:line="360" w:lineRule="auto" w:after="120"/>
-        <w:ind w:firstLine="432"/>
-        <w:jc w:val="both"/>
-      </w:pPr>
-      <w:r>
-        <w:rPr>
-          <w:rFonts w:ascii="Times New Roman" w:hAnsi="Times New Roman"/>
-          <w:b w:val="0"/>
-          <w:i w:val="0"/>
-          <w:sz w:val="22"/>
-        </w:rPr>
-        <w:t>This proof-of-concept study demonstrates that small-cohort clinical machine learning for postoperative seizure after cSDH evacuation can be honestly deployable when calibration and individual-patient decision support — not discrimination — are treated as the optimisation target. Firth penalized logistic regression matches the published BalancedRandomForest baseline on AUC, delivers three-fold better calibration, and supports class-conditional conformal prediction sets that confidently rule out seizure in approximately one quarter of patients at a 90% coverage guarantee. Multi-database evaluation across BIDMC, eICU and NIS confirms low between-hospital heterogeneity (I² = 0%) and identifies a corrected outcome definition for future nationwide analyses.</w:t>
-      </w:r>
-    </w:p>
-    <w:p>
-      <w:pPr>
-        <w:spacing w:line="360" w:lineRule="auto" w:after="120"/>
-        <w:ind w:firstLine="432"/>
-        <w:jc w:val="both"/>
-      </w:pPr>
-      <w:r>
-        <w:rPr>
-          <w:rFonts w:ascii="Times New Roman" w:hAnsi="Times New Roman"/>
-          <w:b w:val="0"/>
-          <w:i w:val="0"/>
-          <w:sz w:val="22"/>
-        </w:rPr>
-        <w:t>The eleven-method modelling battery — spanning six SMOTE-family oversamplers, Optuna-tuned gradient boosting, diverse-base stacking, and Bayesian regression with multiple prior specifications — produced no statistically significant discrimination improvement over the baseline. This null result is concordant with three independent 2022–2025 meta-analyses showing that class-imbalance corrections do not raise AUC in clinical risk models,</w:t>
-      </w:r>
-      <w:r>
-        <w:rPr>
-          <w:rFonts w:ascii="Times New Roman" w:hAnsi="Times New Roman"/>
-          <w:b w:val="0"/>
-          <w:i w:val="0"/>
-          <w:sz w:val="22"/>
-          <w:vertAlign w:val="superscript"/>
-        </w:rPr>
-        <w:t>¹⁷⁻¹⁹</w:t>
-      </w:r>
-      <w:r>
-        <w:rPr>
-          <w:rFonts w:ascii="Times New Roman" w:hAnsi="Times New Roman"/>
-          <w:b w:val="0"/>
-          <w:i w:val="0"/>
-          <w:sz w:val="22"/>
-        </w:rPr>
-        <w:t xml:space="preserve"> and with a February-2026 head-to-head benchmark of tabular foundation models on 12 clinical tasks showing only a 16.7% win rate.</w:t>
-      </w:r>
-      <w:r>
-        <w:rPr>
-          <w:rFonts w:ascii="Times New Roman" w:hAnsi="Times New Roman"/>
-          <w:b w:val="0"/>
-          <w:i w:val="0"/>
-          <w:sz w:val="22"/>
-          <w:vertAlign w:val="superscript"/>
-        </w:rPr>
-        <w:t>²⁰</w:t>
-      </w:r>
-      <w:r>
-        <w:rPr>
-          <w:rFonts w:ascii="Times New Roman" w:hAnsi="Times New Roman"/>
-          <w:b w:val="0"/>
-          <w:i w:val="0"/>
-          <w:sz w:val="22"/>
-        </w:rPr>
-        <w:t xml:space="preserve"> The Bernoulli noise floor on 48 events places the 95% CI half-width on AUC ≈ 0.70 near 0.06; the ceiling we observe is therefore biological, not algorithmic.</w:t>
-      </w:r>
-    </w:p>
-    <w:p>
-      <w:pPr>
-        <w:spacing w:line="360" w:lineRule="auto" w:after="120"/>
-        <w:ind w:firstLine="432"/>
-        <w:jc w:val="both"/>
-      </w:pPr>
-      <w:r>
-        <w:rPr>
-          <w:rFonts w:ascii="Times New Roman" w:hAnsi="Times New Roman"/>
-          <w:b w:val="0"/>
-          <w:i w:val="0"/>
-          <w:sz w:val="22"/>
-        </w:rPr>
-        <w:t>The decision-analytic integration shows that the calibrated deployment model translates directly into clinical value. ML-guided AED prophylaxis dominated current strategies on both cost and QALY axes, and the accompanying value-of-information analysis — to our knowledge the first applied to this clinical question — quantifies the population-scale upper bound on future research investment at approximately $190 million over 10 years. Importantly, the analysis identifies *which* parameters drive the upper bound: per-day cEEG cost, baseline seizure prevalence, and AED relative-risk reduction. Each is addressable through prospective data collection or focused trials.</w:t>
-      </w:r>
-    </w:p>
-    <w:p>
-      <w:pPr>
-        <w:spacing w:line="360" w:lineRule="auto" w:after="120"/>
-        <w:ind w:firstLine="432"/>
-        <w:jc w:val="both"/>
-      </w:pPr>
-      <w:r>
-        <w:rPr>
-          <w:rFonts w:ascii="Times New Roman" w:hAnsi="Times New Roman"/>
-          <w:b w:val="0"/>
-          <w:i w:val="0"/>
-          <w:sz w:val="22"/>
-        </w:rPr>
-        <w:t>Two methodological observations bear on future cSDH research. First, the originally-reported NIS signal for postoperative seizure is driven by outcome misclassification between acute symptomatic seizure and pre-existing epilepsy; under the corrected definition, no population-scale signal remains. We release the cleaned codeset for replication. Second, cross-cohort transfer learning from eICU to BIDMC failed not for statistical reasons but because the underlying age-coefficient signs differ between mixed-acuity ICU SDH and pure post-craniotomy cSDH. Any future transfer-learning attempt in this domain must verify coefficient-sign agreement before adopting informative priors.</w:t>
-      </w:r>
-    </w:p>
-    <w:p>
-      <w:pPr>
-        <w:spacing w:line="360" w:lineRule="auto" w:after="120"/>
-        <w:ind w:firstLine="432"/>
-        <w:jc w:val="both"/>
-      </w:pPr>
-      <w:r>
-        <w:rPr>
-          <w:rFonts w:ascii="Times New Roman" w:hAnsi="Times New Roman"/>
-          <w:b w:val="0"/>
-          <w:i w:val="0"/>
-          <w:sz w:val="22"/>
-        </w:rPr>
-        <w:t>This study has limitations. The development cohort is single-institution, partly mitigated by external evaluation across 139 eICU hospitals with zero between-site heterogeneity. The structured electronic medical record lacks imaging features known to inform seizure risk; we release a regex-pattern radiology NLP feature pipeline (macro-averaged accuracy 91% on a validation set) ready for institutional radiology corpora. Outcome ascertainment is administrative rather than EEG-adjudicated; sensitivity analyses across four time-window cuts preserved the primary AUC. Cost inputs adopt the US-payer perspective; the VOI analysis explicitly identifies per-day cEEG cost as the highest-EVPPI parameter for international refinement.</w:t>
-      </w:r>
-    </w:p>
-    <w:p>
-      <w:pPr>
-        <w:spacing w:line="360" w:lineRule="auto" w:after="120"/>
-        <w:ind w:firstLine="432"/>
-        <w:jc w:val="both"/>
-      </w:pPr>
-      <w:r>
-        <w:rPr>
-          <w:rFonts w:ascii="Times New Roman" w:hAnsi="Times New Roman"/>
-          <w:b w:val="0"/>
-          <w:i w:val="0"/>
-          <w:sz w:val="22"/>
-        </w:rPr>
-        <w:t>In conclusion, calibrated, conformally-deployable machine-learning prediction of postoperative seizure after cSDH evacuation is feasible and supports individual-patient decisions with formal coverage guarantees. ML-guided AED prophylaxis dominates current strategies in a refreshed cost-effectiveness analysis, and value-of-information analysis ranks per-day cEEG cost, seizure prevalence and AED efficacy as the priority targets for future research investment.</w:t>
-      </w:r>
-    </w:p>
-    <w:p>
-      <w:r>
-        <w:br w:type="page"/>
-      </w:r>
-    </w:p>
-    <w:p>
-      <w:pPr>
-        <w:pStyle w:val="Heading1"/>
-      </w:pPr>
-      <w:r>
-        <w:rPr>
-          <w:rFonts w:ascii="Times New Roman" w:hAnsi="Times New Roman"/>
-          <w:color w:val="141F3A"/>
-        </w:rPr>
-        <w:t>References</w:t>
-      </w:r>
-    </w:p>
-    <w:p>
-      <w:pPr>
-        <w:ind w:hanging="432" w:left="432"/>
-      </w:pPr>
-      <w:r>
-        <w:rPr>
-          <w:rFonts w:ascii="Times New Roman" w:hAnsi="Times New Roman"/>
-          <w:sz w:val="20"/>
-        </w:rPr>
-        <w:t>1. Bartek J, Sjåvik K, Schaible S, et al. Long-term outcome after chronic subdural haematoma. Acta Neurochir. 2018;160(11):2275–83.</w:t>
-      </w:r>
-    </w:p>
-    <w:p>
-      <w:pPr>
-        <w:ind w:hanging="432" w:left="432"/>
-      </w:pPr>
-      <w:r>
-        <w:rPr>
-          <w:rFonts w:ascii="Times New Roman" w:hAnsi="Times New Roman"/>
-          <w:sz w:val="20"/>
-        </w:rPr>
-        <w:t>2. Brennan PM, Kolias AG, Joannides AJ, et al. Management and outcome for patients with chronic subdural haematoma. J Neurosurg. 2017;127(4):732–9.</w:t>
-      </w:r>
-    </w:p>
-    <w:p>
-      <w:pPr>
-        <w:ind w:hanging="432" w:left="432"/>
-      </w:pPr>
-      <w:r>
-        <w:rPr>
-          <w:rFonts w:ascii="Times New Roman" w:hAnsi="Times New Roman"/>
-          <w:sz w:val="20"/>
-        </w:rPr>
-        <w:t>3. Adhiyaman V, Asghar M, Ganeshram KN, et al. Chronic subdural haematoma in the elderly. Postgrad Med J. 2002;78(916):71–5.</w:t>
-      </w:r>
-    </w:p>
-    <w:p>
-      <w:pPr>
-        <w:ind w:hanging="432" w:left="432"/>
-      </w:pPr>
-      <w:r>
-        <w:rPr>
-          <w:rFonts w:ascii="Times New Roman" w:hAnsi="Times New Roman"/>
-          <w:sz w:val="20"/>
-        </w:rPr>
-        <w:t>4. Manivannan S, Khan W, Petropoulos A, et al. Seizures after chronic subdural haematoma evacuation. Front Neurol. 2023;14:1145623.</w:t>
-      </w:r>
-    </w:p>
-    <w:p>
-      <w:pPr>
-        <w:ind w:hanging="432" w:left="432"/>
-      </w:pPr>
-      <w:r>
-        <w:rPr>
-          <w:rFonts w:ascii="Times New Roman" w:hAnsi="Times New Roman"/>
-          <w:sz w:val="20"/>
-        </w:rPr>
-        <w:t>5. Chen LW, Chen ML, Lin TY, et al. Postoperative seizure after chronic subdural haematoma. Front Neurol. 2022;13:1041290.</w:t>
-      </w:r>
-    </w:p>
-    <w:p>
-      <w:pPr>
-        <w:ind w:hanging="432" w:left="432"/>
-      </w:pPr>
-      <w:r>
-        <w:rPr>
-          <w:rFonts w:ascii="Times New Roman" w:hAnsi="Times New Roman"/>
-          <w:sz w:val="20"/>
-        </w:rPr>
-        <w:t>6. Sabbagh AJ, Tubaigi SM. Seizure outcomes after surgical evacuation of subdural haematomas. Neurosurg Focus. 2018;44(4):E14.</w:t>
-      </w:r>
-    </w:p>
-    <w:p>
-      <w:pPr>
-        <w:ind w:hanging="432" w:left="432"/>
-      </w:pPr>
-      <w:r>
-        <w:rPr>
-          <w:rFonts w:ascii="Times New Roman" w:hAnsi="Times New Roman"/>
-          <w:sz w:val="20"/>
-        </w:rPr>
-        <w:t>7. Tsai HW, Lee CY, Yang CY, et al. Neuropsychiatric adverse effects in older adults following levetiracetam initiation. PMC11088830. 2024.</w:t>
-      </w:r>
-    </w:p>
-    <w:p>
-      <w:pPr>
-        <w:ind w:hanging="432" w:left="432"/>
-      </w:pPr>
-      <w:r>
-        <w:rPr>
-          <w:rFonts w:ascii="Times New Roman" w:hAnsi="Times New Roman"/>
-          <w:sz w:val="20"/>
-        </w:rPr>
-        <w:t>8. de Bresser J, et al. Perioperative levetiracetam in seizure-naïve brain tumour patients: neurocognitive outcomes. BMC Neurol. 2022;22:245.</w:t>
-      </w:r>
-    </w:p>
-    <w:p>
-      <w:pPr>
-        <w:ind w:hanging="432" w:left="432"/>
-      </w:pPr>
-      <w:r>
-        <w:rPr>
-          <w:rFonts w:ascii="Times New Roman" w:hAnsi="Times New Roman"/>
-          <w:sz w:val="20"/>
-        </w:rPr>
-        <w:t>9. Maximos M, Chang F, Patel T. AED-associated falls in ambulatory elderly. Epilepsy Res. 2017;131:25–31.</w:t>
-      </w:r>
-    </w:p>
-    <w:p>
-      <w:pPr>
-        <w:ind w:hanging="432" w:left="432"/>
-      </w:pPr>
-      <w:r>
-        <w:rPr>
-          <w:rFonts w:ascii="Times New Roman" w:hAnsi="Times New Roman"/>
-          <w:sz w:val="20"/>
-        </w:rPr>
-        <w:t>10. Liang H, et al. Perioperative levetiracetam for postoperative seizure prevention: meta-analysis. PMC11925779. 2025.</w:t>
-      </w:r>
-    </w:p>
-    <w:p>
-      <w:pPr>
-        <w:ind w:hanging="432" w:left="432"/>
-      </w:pPr>
-      <w:r>
-        <w:rPr>
-          <w:rFonts w:ascii="Times New Roman" w:hAnsi="Times New Roman"/>
-          <w:sz w:val="20"/>
-        </w:rPr>
-        <w:t>11. Vespa PM, Olson DM, John S, et al. Evaluating the clinical impact of rapid-response electroencephalography (DECIDE). Crit Care Med. 2020;48(9):1249–57.</w:t>
-      </w:r>
-    </w:p>
-    <w:p>
-      <w:pPr>
-        <w:ind w:hanging="432" w:left="432"/>
-      </w:pPr>
-      <w:r>
-        <w:rPr>
-          <w:rFonts w:ascii="Times New Roman" w:hAnsi="Times New Roman"/>
-          <w:sz w:val="20"/>
-        </w:rPr>
-        <w:t>12. Parvizi J, Cole AJ, Hirsch LJ. Economic value of rapid-EEG. J Med Econ. 2021;24(1):318–26.</w:t>
-      </w:r>
-    </w:p>
-    <w:p>
-      <w:pPr>
-        <w:ind w:hanging="432" w:left="432"/>
-      </w:pPr>
-      <w:r>
-        <w:rPr>
-          <w:rFonts w:ascii="Times New Roman" w:hAnsi="Times New Roman"/>
-          <w:sz w:val="20"/>
-        </w:rPr>
-        <w:t>13. Kamousi B, Vespa P, Hirsch LJ, et al. Multicenter rapid-EEG vs conventional EEG seizure capture. Front Neurol. 2022;13:937515.</w:t>
-      </w:r>
-    </w:p>
-    <w:p>
-      <w:pPr>
-        <w:ind w:hanging="432" w:left="432"/>
-      </w:pPr>
-      <w:r>
-        <w:rPr>
-          <w:rFonts w:ascii="Times New Roman" w:hAnsi="Times New Roman"/>
-          <w:sz w:val="20"/>
-        </w:rPr>
-        <w:t>14. Mohammadi M, Habibzadeh F, Smith J. Machine-learning prediction of seizure after cSDH: pilot. Cureus. 2021;13:e1234. [example placeholder]</w:t>
-      </w:r>
-    </w:p>
-    <w:p>
-      <w:pPr>
-        <w:ind w:hanging="432" w:left="432"/>
-      </w:pPr>
-      <w:r>
-        <w:rPr>
-          <w:rFonts w:ascii="Times New Roman" w:hAnsi="Times New Roman"/>
-          <w:sz w:val="20"/>
-        </w:rPr>
-        <w:t>15. Cohen JT, Patel A, Smith P. Random-forest seizure prediction in neurocritical care. JAMIA. 2020;27(6):987–95. [example placeholder]</w:t>
-      </w:r>
-    </w:p>
-    <w:p>
-      <w:pPr>
-        <w:ind w:hanging="432" w:left="432"/>
-      </w:pPr>
-      <w:r>
-        <w:rPr>
-          <w:rFonts w:ascii="Times New Roman" w:hAnsi="Times New Roman"/>
-          <w:sz w:val="20"/>
-        </w:rPr>
-        <w:t>16. Singh A, Brown B, Garcia D. Limitations of single-centre ML models in neurosurgery. NeurosurgFocus. 2022;52(4):E10. [example placeholder]</w:t>
-      </w:r>
-    </w:p>
-    <w:p>
-      <w:pPr>
-        <w:ind w:hanging="432" w:left="432"/>
-      </w:pPr>
-      <w:r>
-        <w:rPr>
-          <w:rFonts w:ascii="Times New Roman" w:hAnsi="Times New Roman"/>
-          <w:sz w:val="20"/>
-        </w:rPr>
-        <w:t>17. van den Goorbergh R, et al. The harm of class-imbalance corrections for risk prediction. JAMIA. 2022;29(9):1525–34.</w:t>
-      </w:r>
-    </w:p>
-    <w:p>
-      <w:pPr>
-        <w:ind w:hanging="432" w:left="432"/>
-      </w:pPr>
-      <w:r>
-        <w:rPr>
-          <w:rFonts w:ascii="Times New Roman" w:hAnsi="Times New Roman"/>
-          <w:sz w:val="20"/>
-        </w:rPr>
-        <w:t>18. Carriero J, et al. Tipping the Balance: class imbalance corrections in clinical prediction. arXiv:2404.19494. 2024.</w:t>
-      </w:r>
-    </w:p>
-    <w:p>
-      <w:pPr>
-        <w:ind w:hanging="432" w:left="432"/>
-      </w:pPr>
-      <w:r>
-        <w:rPr>
-          <w:rFonts w:ascii="Times New Roman" w:hAnsi="Times New Roman"/>
-          <w:sz w:val="20"/>
-        </w:rPr>
-        <w:t>19. Piccininni M, Wechsung M, Van Calster B. Random resampling and calibration. J Biomed Inform. 2024;155:104666.</w:t>
-      </w:r>
-    </w:p>
-    <w:p>
-      <w:pPr>
-        <w:ind w:hanging="432" w:left="432"/>
-      </w:pPr>
-      <w:r>
-        <w:rPr>
-          <w:rFonts w:ascii="Times New Roman" w:hAnsi="Times New Roman"/>
-          <w:sz w:val="20"/>
-        </w:rPr>
-        <w:t>20. Anonymous. Tabular foundation models in clinical predictions: head-to-head benchmark. medRxiv. 2026; doi:10.64898/2026.02.02.26345274v1.</w:t>
-      </w:r>
-    </w:p>
-    <w:p>
-      <w:pPr>
-        <w:ind w:hanging="432" w:left="432"/>
-      </w:pPr>
-      <w:r>
-        <w:rPr>
-          <w:rFonts w:ascii="Times New Roman" w:hAnsi="Times New Roman"/>
-          <w:sz w:val="20"/>
-        </w:rPr>
-        <w:t>21. Hollmann N, et al. Accurate predictions on small data with a tabular foundation model. Nature. 2025;637:319–26.</w:t>
-      </w:r>
-    </w:p>
-    <w:p>
-      <w:pPr>
-        <w:ind w:hanging="432" w:left="432"/>
-      </w:pPr>
-      <w:r>
-        <w:rPr>
-          <w:rFonts w:ascii="Times New Roman" w:hAnsi="Times New Roman"/>
-          <w:sz w:val="20"/>
-        </w:rPr>
-        <w:t>22. Collins GS, Moons KGM, Dhiman P, et al. TRIPOD+AI statement. BMJ. 2024;385:e078378.</w:t>
-      </w:r>
-    </w:p>
-    <w:p>
-      <w:pPr>
-        <w:ind w:hanging="432" w:left="432"/>
-      </w:pPr>
-      <w:r>
-        <w:rPr>
-          <w:rFonts w:ascii="Times New Roman" w:hAnsi="Times New Roman"/>
-          <w:sz w:val="20"/>
-        </w:rPr>
-        <w:t>23. Vovk V, Gammerman A, Shafer G. Algorithmic Learning in a Random World. Springer; 2005.</w:t>
-      </w:r>
-    </w:p>
-    <w:p>
-      <w:pPr>
-        <w:ind w:hanging="432" w:left="432"/>
-      </w:pPr>
-      <w:r>
-        <w:rPr>
-          <w:rFonts w:ascii="Times New Roman" w:hAnsi="Times New Roman"/>
-          <w:sz w:val="20"/>
-        </w:rPr>
-        <w:t>24. Angelopoulos AN, Bates S. A gentle introduction to conformal prediction. arXiv:2107.07511. 2021.</w:t>
-      </w:r>
-    </w:p>
-    <w:p>
-      <w:pPr>
-        <w:ind w:hanging="432" w:left="432"/>
-      </w:pPr>
-      <w:r>
-        <w:rPr>
-          <w:rFonts w:ascii="Times New Roman" w:hAnsi="Times New Roman"/>
-          <w:sz w:val="20"/>
-        </w:rPr>
-        <w:t>25. Neumann PJ, Cohen JT, Weinstein MC. Updating cost-effectiveness — the curious resilience of the $50,000-per-QALY threshold. N Engl J Med. 2014;371:796–7.</w:t>
-      </w:r>
-    </w:p>
-    <w:p>
-      <w:pPr>
-        <w:ind w:hanging="432" w:left="432"/>
-      </w:pPr>
-      <w:r>
-        <w:rPr>
-          <w:rFonts w:ascii="Times New Roman" w:hAnsi="Times New Roman"/>
-          <w:sz w:val="20"/>
-        </w:rPr>
-        <w:t>26. Vanness DJ, Lomas J, Ahn H. A health opportunity-cost approach to US CEA. Ann Intern Med. 2021;174(1):25–32.</w:t>
-      </w:r>
-    </w:p>
-    <w:p>
-      <w:pPr>
-        <w:ind w:hanging="432" w:left="432"/>
-      </w:pPr>
-      <w:r>
-        <w:rPr>
-          <w:rFonts w:ascii="Times New Roman" w:hAnsi="Times New Roman"/>
-          <w:sz w:val="20"/>
-        </w:rPr>
-        <w:t>27. Crespo C, Monleón A, Díaz W, et al. CE thresholds used by study authors, 1990–2021. Value Health. 2023.</w:t>
-      </w:r>
-    </w:p>
-    <w:p>
-      <w:pPr>
-        <w:ind w:hanging="432" w:left="432"/>
-      </w:pPr>
-      <w:r>
-        <w:rPr>
-          <w:rFonts w:ascii="Times New Roman" w:hAnsi="Times New Roman"/>
-          <w:sz w:val="20"/>
-        </w:rPr>
-        <w:t>28. Strong M, Oakley JE, Brennan A. Estimating EVPPI using non-parametric regression. Med Decis Making. 2014;34(3):311–26.</w:t>
-      </w:r>
-    </w:p>
-    <w:p>
-      <w:pPr>
-        <w:ind w:hanging="432" w:left="432"/>
-      </w:pPr>
-      <w:r>
-        <w:rPr>
-          <w:rFonts w:ascii="Times New Roman" w:hAnsi="Times New Roman"/>
-          <w:sz w:val="20"/>
-        </w:rPr>
-        <w:t>29. Heath A, Manolopoulou I, Baio G. Estimating expected value of partial perfect information via SPDE-INLA. Stat Med. 2018;37(7):1093–113.</w:t>
-      </w:r>
-    </w:p>
-    <w:p>
-      <w:pPr>
-        <w:ind w:hanging="432" w:left="432"/>
-      </w:pPr>
-      <w:r>
-        <w:rPr>
-          <w:rFonts w:ascii="Times New Roman" w:hAnsi="Times New Roman"/>
-          <w:sz w:val="20"/>
-        </w:rPr>
-        <w:t>30. Pollard TJ, Johnson AEW, Raffa JD, et al. The eICU Collaborative Research Database. Sci Data. 2018;5:180178.</w:t>
-      </w:r>
-    </w:p>
-    <w:p>
-      <w:pPr>
-        <w:ind w:hanging="432" w:left="432"/>
-      </w:pPr>
-      <w:r>
-        <w:rPr>
-          <w:rFonts w:ascii="Times New Roman" w:hAnsi="Times New Roman"/>
-          <w:sz w:val="20"/>
-        </w:rPr>
-        <w:t>31. Johnson AEW, Bulgarelli L, Shen L, et al. MIMIC-IV, a freely accessible electronic health record dataset. Sci Data. 2023;10:1.</w:t>
-      </w:r>
-    </w:p>
-    <w:p>
-      <w:pPr>
-        <w:ind w:hanging="432" w:left="432"/>
-      </w:pPr>
-      <w:r>
-        <w:rPr>
-          <w:rFonts w:ascii="Times New Roman" w:hAnsi="Times New Roman"/>
-          <w:sz w:val="20"/>
-        </w:rPr>
-        <w:t>32. Chawla NV, Bowyer KW, Hall LO, Kegelmeyer WP. SMOTE. J Artif Intell Res. 2002;16:321–57.</w:t>
-      </w:r>
-    </w:p>
-    <w:p>
-      <w:pPr>
-        <w:ind w:hanging="432" w:left="432"/>
-      </w:pPr>
-      <w:r>
-        <w:rPr>
-          <w:rFonts w:ascii="Times New Roman" w:hAnsi="Times New Roman"/>
-          <w:sz w:val="20"/>
-        </w:rPr>
-        <w:t>33. Han H, Wang W, Mao B. Borderline-SMOTE. ICIC. 2005;3644:878–87.</w:t>
-      </w:r>
-    </w:p>
-    <w:p>
-      <w:pPr>
-        <w:ind w:hanging="432" w:left="432"/>
-      </w:pPr>
-      <w:r>
-        <w:rPr>
-          <w:rFonts w:ascii="Times New Roman" w:hAnsi="Times New Roman"/>
-          <w:sz w:val="20"/>
-        </w:rPr>
-        <w:t>34. Nguyen HM, Cooper EW, Kamei K. SVM-SMOTE. Int J Knowl Eng Soft Data Paradigms. 2011;3:4–21.</w:t>
-      </w:r>
-    </w:p>
-    <w:p>
-      <w:pPr>
-        <w:ind w:hanging="432" w:left="432"/>
-      </w:pPr>
-      <w:r>
-        <w:rPr>
-          <w:rFonts w:ascii="Times New Roman" w:hAnsi="Times New Roman"/>
-          <w:sz w:val="20"/>
-        </w:rPr>
-        <w:t>35. Firth D. Bias reduction of maximum likelihood estimates. Biometrika. 1993;80(1):27–38.</w:t>
-      </w:r>
-    </w:p>
-    <w:p>
-      <w:pPr>
-        <w:ind w:hanging="432" w:left="432"/>
-      </w:pPr>
-      <w:r>
-        <w:rPr>
-          <w:rFonts w:ascii="Times New Roman" w:hAnsi="Times New Roman"/>
-          <w:sz w:val="20"/>
-        </w:rPr>
-        <w:t>36. Puhr R, Heinze G, Nold M, Lusa L, Geroldinger A. Firth's logistic regression with rare events. Stat Med. 2017;36(14):2302–17.</w:t>
-      </w:r>
-    </w:p>
-    <w:p>
-      <w:pPr>
-        <w:ind w:hanging="432" w:left="432"/>
-      </w:pPr>
-      <w:r>
-        <w:rPr>
-          <w:rFonts w:ascii="Times New Roman" w:hAnsi="Times New Roman"/>
-          <w:sz w:val="20"/>
-        </w:rPr>
-        <w:t>37. DerSimonian R, Laird N. Meta-analysis in clinical trials. Control Clin Trials. 1986;7(3):177–88.</w:t>
-      </w:r>
-    </w:p>
-    <w:p>
-      <w:pPr>
-        <w:ind w:hanging="432" w:left="432"/>
-      </w:pPr>
-      <w:r>
-        <w:rPr>
-          <w:rFonts w:ascii="Times New Roman" w:hAnsi="Times New Roman"/>
-          <w:sz w:val="20"/>
-        </w:rPr>
-        <w:t>38. Geskus RB. Cause-specific cumulative incidence estimation under competing risks (IPCW). Biometrics. 2011;67:39–49.</w:t>
       </w:r>
     </w:p>
     <w:sectPr>

</xml_diff>

<commit_message>
Move all figure legends outside axes; fix LaTeX-mode dollar signs
Across F1-F6, inline per-axes legends are replaced by a single shared
legend below each figure. The previous inline placements collided with
data points and axis labels — particularly in F2 (decision-curve net
benefit), F3 (method-battery Brier panel), and F4 (conformal rule-out
panel).

Bottom margins were widened on every figure to accommodate the external
legend without squashing the x-axis labels. F5 (CEA composite) is
unchanged because it has no inline legends.

Also escaped dollar signs in the F6 axis labels so the WTP/EVPPI
captions render with normal spacing instead of being interpreted as
LaTeX math-mode delimiters.
</commit_message>
<xml_diff>
--- a/docs/JNNP_main_manuscript.docx
+++ b/docs/JNNP_main_manuscript.docx
@@ -2306,7 +2306,7 @@
       <w:r>
         <w:drawing>
           <wp:inline xmlns:a="http://schemas.openxmlformats.org/drawingml/2006/main" xmlns:pic="http://schemas.openxmlformats.org/drawingml/2006/picture">
-            <wp:extent cx="5943600" cy="4463563"/>
+            <wp:extent cx="5943600" cy="5288339"/>
             <wp:docPr id="1" name="Picture 1"/>
             <wp:cNvGraphicFramePr>
               <a:graphicFrameLocks noChangeAspect="1"/>
@@ -2327,7 +2327,7 @@
                   <pic:spPr>
                     <a:xfrm>
                       <a:off x="0" y="0"/>
-                      <a:ext cx="5943600" cy="4463563"/>
+                      <a:ext cx="5943600" cy="5288339"/>
                     </a:xfrm>
                     <a:prstGeom prst="rect"/>
                   </pic:spPr>
@@ -2372,7 +2372,7 @@
       <w:r>
         <w:drawing>
           <wp:inline xmlns:a="http://schemas.openxmlformats.org/drawingml/2006/main" xmlns:pic="http://schemas.openxmlformats.org/drawingml/2006/picture">
-            <wp:extent cx="5943600" cy="3464082"/>
+            <wp:extent cx="5943600" cy="4030452"/>
             <wp:docPr id="2" name="Picture 2"/>
             <wp:cNvGraphicFramePr>
               <a:graphicFrameLocks noChangeAspect="1"/>
@@ -2393,7 +2393,7 @@
                   <pic:spPr>
                     <a:xfrm>
                       <a:off x="0" y="0"/>
-                      <a:ext cx="5943600" cy="3464082"/>
+                      <a:ext cx="5943600" cy="4030452"/>
                     </a:xfrm>
                     <a:prstGeom prst="rect"/>
                   </pic:spPr>
@@ -2438,7 +2438,7 @@
       <w:r>
         <w:drawing>
           <wp:inline xmlns:a="http://schemas.openxmlformats.org/drawingml/2006/main" xmlns:pic="http://schemas.openxmlformats.org/drawingml/2006/picture">
-            <wp:extent cx="5943600" cy="3981166"/>
+            <wp:extent cx="5943600" cy="5040130"/>
             <wp:docPr id="3" name="Picture 3"/>
             <wp:cNvGraphicFramePr>
               <a:graphicFrameLocks noChangeAspect="1"/>
@@ -2459,7 +2459,7 @@
                   <pic:spPr>
                     <a:xfrm>
                       <a:off x="0" y="0"/>
-                      <a:ext cx="5943600" cy="3981166"/>
+                      <a:ext cx="5943600" cy="5040130"/>
                     </a:xfrm>
                     <a:prstGeom prst="rect"/>
                   </pic:spPr>
@@ -2504,7 +2504,7 @@
       <w:r>
         <w:drawing>
           <wp:inline xmlns:a="http://schemas.openxmlformats.org/drawingml/2006/main" xmlns:pic="http://schemas.openxmlformats.org/drawingml/2006/picture">
-            <wp:extent cx="5943600" cy="3188510"/>
+            <wp:extent cx="5943600" cy="3837123"/>
             <wp:docPr id="4" name="Picture 4"/>
             <wp:cNvGraphicFramePr>
               <a:graphicFrameLocks noChangeAspect="1"/>
@@ -2525,7 +2525,7 @@
                   <pic:spPr>
                     <a:xfrm>
                       <a:off x="0" y="0"/>
-                      <a:ext cx="5943600" cy="3188510"/>
+                      <a:ext cx="5943600" cy="3837123"/>
                     </a:xfrm>
                     <a:prstGeom prst="rect"/>
                   </pic:spPr>
@@ -2636,7 +2636,7 @@
       <w:r>
         <w:drawing>
           <wp:inline xmlns:a="http://schemas.openxmlformats.org/drawingml/2006/main" xmlns:pic="http://schemas.openxmlformats.org/drawingml/2006/picture">
-            <wp:extent cx="5943600" cy="3314088"/>
+            <wp:extent cx="5943600" cy="3921715"/>
             <wp:docPr id="6" name="Picture 6"/>
             <wp:cNvGraphicFramePr>
               <a:graphicFrameLocks noChangeAspect="1"/>
@@ -2657,7 +2657,7 @@
                   <pic:spPr>
                     <a:xfrm>
                       <a:off x="0" y="0"/>
-                      <a:ext cx="5943600" cy="3314088"/>
+                      <a:ext cx="5943600" cy="3921715"/>
                     </a:xfrm>
                     <a:prstGeom prst="rect"/>
                   </pic:spPr>

</xml_diff>